<commit_message>
feat(release): synchronize 213 customer installation baseline
</commit_message>
<xml_diff>
--- a/storage/templates/normalized-docx/BM-001/BM-001_normalized.docx
+++ b/storage/templates/normalized-docx/BM-001/BM-001_normalized.docx
@@ -5,6 +5,143 @@
     <w:p>
       <w:pPr>
         <w:rPr>
+          <w:sz w:val="16"/>
+          <w:szCs w:val="16"/>
+        </w:rPr>
+        <w:jc w:val="right"/>
+      </w:pPr>
+      <w:r>
+        <w:rPr>
+          <w:rFonts w:ascii="Times New Roman" w:hAnsi="Times New Roman" w:cs="Times New Roman"/>
+          <w:b/>
+          <w:sz w:val="16"/>
+          <w:szCs w:val="16"/>
+          <w:color w:val="000000"/>
+        </w:rPr>
+        <w:t xml:space="preserve">Mẫu số 01/HS</w:t>
+      </w:r>
+    </w:p>
+    <w:p>
+      <w:pPr>
+        <w:rPr>
+          <w:sz w:val="16"/>
+          <w:szCs w:val="16"/>
+        </w:rPr>
+        <w:jc w:val="right"/>
+      </w:pPr>
+      <w:r>
+        <w:rPr>
+          <w:rFonts w:ascii="Times New Roman" w:hAnsi="Times New Roman" w:cs="Times New Roman"/>
+          <w:i/>
+          <w:spacing w:val="-4"/>
+          <w:sz w:val="16"/>
+          <w:szCs w:val="16"/>
+          <w:color w:val="000000"/>
+        </w:rPr>
+        <w:t xml:space="preserve">(Ban hành theo Thông tư  số</w:t>
+      </w:r>
+      <w:r>
+        <w:rPr>
+          <w:rFonts w:ascii="Times New Roman" w:hAnsi="Times New Roman" w:cs="Times New Roman"/>
+          <w:i/>
+          <w:spacing w:val="-4"/>
+          <w:sz w:val="16"/>
+          <w:szCs w:val="16"/>
+          <w:lang w:val="vi-VN"/>
+          <w:color w:val="000000"/>
+        </w:rPr>
+        <w:t xml:space="preserve"> 03</w:t>
+      </w:r>
+      <w:r>
+        <w:rPr>
+          <w:rFonts w:ascii="Times New Roman" w:hAnsi="Times New Roman" w:cs="Times New Roman"/>
+          <w:i/>
+          <w:spacing w:val="-4"/>
+          <w:sz w:val="16"/>
+          <w:szCs w:val="16"/>
+          <w:color w:val="000000"/>
+        </w:rPr>
+        <w:t xml:space="preserve">/2026/TT-VKSTC </w:t>
+      </w:r>
+    </w:p>
+    <w:p>
+      <w:pPr>
+        <w:rPr>
+          <w:sz w:val="16"/>
+          <w:szCs w:val="16"/>
+        </w:rPr>
+        <w:jc w:val="right"/>
+      </w:pPr>
+      <w:r>
+        <w:rPr>
+          <w:rFonts w:ascii="Times New Roman" w:hAnsi="Times New Roman" w:cs="Times New Roman"/>
+          <w:i/>
+          <w:spacing w:val="-4"/>
+          <w:sz w:val="16"/>
+          <w:szCs w:val="16"/>
+          <w:color w:val="000000"/>
+        </w:rPr>
+        <w:t xml:space="preserve">Ngày</w:t>
+      </w:r>
+      <w:r>
+        <w:rPr>
+          <w:rFonts w:ascii="Times New Roman" w:hAnsi="Times New Roman" w:cs="Times New Roman"/>
+          <w:i/>
+          <w:spacing w:val="-4"/>
+          <w:sz w:val="16"/>
+          <w:szCs w:val="16"/>
+          <w:lang w:val="vi-VN"/>
+          <w:color w:val="000000"/>
+        </w:rPr>
+        <w:t xml:space="preserve"> 09</w:t>
+      </w:r>
+      <w:r>
+        <w:rPr>
+          <w:rFonts w:ascii="Times New Roman" w:hAnsi="Times New Roman" w:cs="Times New Roman"/>
+          <w:i/>
+          <w:spacing w:val="-4"/>
+          <w:sz w:val="16"/>
+          <w:szCs w:val="16"/>
+          <w:color w:val="000000"/>
+        </w:rPr>
+        <w:t xml:space="preserve">/</w:t>
+      </w:r>
+      <w:r>
+        <w:rPr>
+          <w:rFonts w:ascii="Times New Roman" w:hAnsi="Times New Roman" w:cs="Times New Roman"/>
+          <w:i/>
+          <w:spacing w:val="-4"/>
+          <w:sz w:val="16"/>
+          <w:szCs w:val="16"/>
+          <w:lang w:val="vi-VN"/>
+          <w:color w:val="000000"/>
+        </w:rPr>
+        <w:t xml:space="preserve">02</w:t>
+      </w:r>
+      <w:r>
+        <w:rPr>
+          <w:rFonts w:ascii="Times New Roman" w:hAnsi="Times New Roman" w:cs="Times New Roman"/>
+          <w:i/>
+          <w:spacing w:val="-4"/>
+          <w:sz w:val="16"/>
+          <w:szCs w:val="16"/>
+          <w:color w:val="000000"/>
+        </w:rPr>
+        <w:t xml:space="preserve">/2026)</w:t>
+      </w:r>
+      <w:r>
+        <w:rPr>
+          <w:rFonts w:ascii="Times New Roman" w:hAnsi="Times New Roman" w:cs="Times New Roman"/>
+          <w:sz w:val="16"/>
+          <w:szCs w:val="16"/>
+          <w:color w:val="000000"/>
+        </w:rPr>
+        <w:t xml:space="preserve"> </w:t>
+      </w:r>
+    </w:p>
+    <w:p>
+      <w:pPr>
+        <w:rPr>
           <w:rFonts w:ascii="Times New Roman" w:hAnsi="Times New Roman" w:cs="Times New Roman"/>
           <w:b/>
           <w:bCs/>
@@ -15,160 +152,10 @@
         <w:rPr>
           <w:noProof/>
         </w:rPr>
-        <w:pict w14:anchorId="223346CE">
-          <v:shapetype id="_x0000_t202" coordsize="21600,21600" o:spt="202" path="m,l,21600r21600,l21600,xe">
-            <v:stroke joinstyle="miter"/>
-            <v:path gradientshapeok="t" o:connecttype="rect"/>
-          </v:shapetype>
-          <v:shape id="Frame1" o:spid="_x0000_s1027" type="#_x0000_t202" style="position:absolute;margin-left:298pt;margin-top:-35.8pt;width:196.05pt;height:40.25pt;z-index:1;visibility:visible;mso-wrap-style:square;mso-wrap-distance-left:9.05pt;mso-wrap-distance-top:0;mso-wrap-distance-right:9.05pt;mso-wrap-distance-bottom:0;mso-position-horizontal:absolute;mso-position-horizontal-relative:text;mso-position-vertical:absolute;mso-position-vertical-relative:text;v-text-anchor:top" o:gfxdata="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" strokecolor="white">
-            <v:textbox>
-              <w:txbxContent>
-                <w:p>
-                  <w:pPr>
-                    <w:jc w:val="center"/>
-                    <w:rPr>
-                      <w:sz w:val="16"/>
-                      <w:szCs w:val="16"/>
-                    </w:rPr>
-                  </w:pPr>
-                  <w:r>
-                    <w:rPr>
-                      <w:rFonts w:ascii="Times New Roman" w:hAnsi="Times New Roman" w:cs="Times New Roman"/>
-                      <w:b/>
-                      <w:sz w:val="16"/>
-                      <w:szCs w:val="16"/>
-                      <w:color w:val="000000"/>
-                    </w:rPr>
-                    <w:t>Mẫu số 01/HS</w:t>
-                  </w:r>
-                </w:p>
-                <w:p>
-                  <w:pPr>
-                    <w:jc w:val="center"/>
-                    <w:rPr>
-                      <w:sz w:val="16"/>
-                      <w:szCs w:val="16"/>
-                    </w:rPr>
-                  </w:pPr>
-                  <w:r>
-                    <w:rPr>
-                      <w:rFonts w:ascii="Times New Roman" w:hAnsi="Times New Roman" w:cs="Times New Roman"/>
-                      <w:i/>
-                      <w:spacing w:val="-4"/>
-                      <w:sz w:val="16"/>
-                      <w:szCs w:val="16"/>
-                      <w:color w:val="000000"/>
-                    </w:rPr>
-                    <w:t>(Ban hành theo Thông tư  số</w:t>
-                  </w:r>
-                  <w:r>
-                    <w:rPr>
-                      <w:rFonts w:ascii="Times New Roman" w:hAnsi="Times New Roman" w:cs="Times New Roman"/>
-                      <w:i/>
-                      <w:spacing w:val="-4"/>
-                      <w:sz w:val="16"/>
-                      <w:szCs w:val="16"/>
-                      <w:lang w:val="vi-VN"/>
-                      <w:color w:val="000000"/>
-                    </w:rPr>
-                    <w:t xml:space="preserve"> 03</w:t>
-                  </w:r>
-                  <w:r>
-                    <w:rPr>
-                      <w:rFonts w:ascii="Times New Roman" w:hAnsi="Times New Roman" w:cs="Times New Roman"/>
-                      <w:i/>
-                      <w:spacing w:val="-4"/>
-                      <w:sz w:val="16"/>
-                      <w:szCs w:val="16"/>
-                      <w:color w:val="000000"/>
-                    </w:rPr>
-                    <w:t xml:space="preserve">/2026/TT-VKSTC </w:t>
-                  </w:r>
-                </w:p>
-                <w:p>
-                  <w:pPr>
-                    <w:jc w:val="center"/>
-                    <w:rPr>
-                      <w:sz w:val="16"/>
-                      <w:szCs w:val="16"/>
-                    </w:rPr>
-                  </w:pPr>
-                  <w:r>
-                    <w:rPr>
-                      <w:rFonts w:ascii="Times New Roman" w:hAnsi="Times New Roman" w:cs="Times New Roman"/>
-                      <w:i/>
-                      <w:spacing w:val="-4"/>
-                      <w:sz w:val="16"/>
-                      <w:szCs w:val="16"/>
-                      <w:color w:val="000000"/>
-                    </w:rPr>
-                    <w:t>Ngày</w:t>
-                  </w:r>
-                  <w:r>
-                    <w:rPr>
-                      <w:rFonts w:ascii="Times New Roman" w:hAnsi="Times New Roman" w:cs="Times New Roman"/>
-                      <w:i/>
-                      <w:spacing w:val="-4"/>
-                      <w:sz w:val="16"/>
-                      <w:szCs w:val="16"/>
-                      <w:lang w:val="vi-VN"/>
-                      <w:color w:val="000000"/>
-                    </w:rPr>
-                    <w:t xml:space="preserve"> 09</w:t>
-                  </w:r>
-                  <w:r>
-                    <w:rPr>
-                      <w:rFonts w:ascii="Times New Roman" w:hAnsi="Times New Roman" w:cs="Times New Roman"/>
-                      <w:i/>
-                      <w:spacing w:val="-4"/>
-                      <w:sz w:val="16"/>
-                      <w:szCs w:val="16"/>
-                      <w:color w:val="000000"/>
-                    </w:rPr>
-                    <w:t>/</w:t>
-                  </w:r>
-                  <w:r>
-                    <w:rPr>
-                      <w:rFonts w:ascii="Times New Roman" w:hAnsi="Times New Roman" w:cs="Times New Roman"/>
-                      <w:i/>
-                      <w:spacing w:val="-4"/>
-                      <w:sz w:val="16"/>
-                      <w:szCs w:val="16"/>
-                      <w:lang w:val="vi-VN"/>
-                      <w:color w:val="000000"/>
-                    </w:rPr>
-                    <w:t>02</w:t>
-                  </w:r>
-                  <w:r>
-                    <w:rPr>
-                      <w:rFonts w:ascii="Times New Roman" w:hAnsi="Times New Roman" w:cs="Times New Roman"/>
-                      <w:i/>
-                      <w:spacing w:val="-4"/>
-                      <w:sz w:val="16"/>
-                      <w:szCs w:val="16"/>
-                      <w:color w:val="000000"/>
-                    </w:rPr>
-                    <w:t>/2026)</w:t>
-                  </w:r>
-                  <w:r>
-                    <w:rPr>
-                      <w:rFonts w:ascii="Times New Roman" w:hAnsi="Times New Roman" w:cs="Times New Roman"/>
-                      <w:sz w:val="16"/>
-                      <w:szCs w:val="16"/>
-                      <w:color w:val="000000"/>
-                    </w:rPr>
-                    <w:t xml:space="preserve"> </w:t>
-                  </w:r>
-                </w:p>
-              </w:txbxContent>
-            </v:textbox>
-          </v:shape>
-        </w:pict>
       </w:r>
     </w:p>
     <w:tbl>
       <w:tblPr>
-        <w:tblpPr w:rightFromText="180" w:vertAnchor="page" w:horzAnchor="page" w:tblpX="1290" w:tblpY="1509"/>
         <w:tblW w:w="9899" w:type="dxa"/>
         <w:tblLayout w:type="fixed"/>
         <w:tblLook w:val="04A0" w:firstRow="1" w:lastRow="0" w:firstColumn="1" w:lastColumn="0" w:noHBand="0" w:noVBand="1"/>

</xml_diff>